<commit_message>
feat(v15 final): English-only template + visual bug fixes
- Template Table of Contents-Relaxor AFE-ZGY-HW.docx fully English-ified (headings + guidance); {paper.X} placeholders preserved
- SlidePlanner _extract_group_preview_bullets adds rule-based fallback (first sentence of first paragraph) → KEY POINTS card never empty
- pptx.py adaptive right-pane layout when observations present without bullets (no overlap)
- Minimum font sizes enforced (eyebrow 11pt, body 14pt, observations 11pt)
- Re-rendered 3 test papers (he2023, ali2025_flash, yang2025) with Reasoner end-to-end

Co-Authored-By: Claude Opus 4.7 <noreply@anthropic.com>
</commit_message>
<xml_diff>
--- a/Table of Contents-Relaxor AFE-ZGY-HW.docx
+++ b/Table of Contents-Relaxor AFE-ZGY-HW.docx
@@ -149,9 +149,9 @@
         <w:rPr>
           <w:rFonts w:ascii="Times New Roman" w:hAnsi="Times New Roman" w:cs="Times New Roman"/>
         </w:rPr>
-        <w:t xml:space="preserve">Introduction </w:t>
+        <w:t>Introduction</w:t>
         <w:br/>
-        <w:t>(研究背景与意义：{paper.system})</w:t>
+        <w:t>(Research background and motivation: {paper.system})</w:t>
       </w:r>
       <w:r>
         <w:rPr>
@@ -221,7 +221,7 @@
         <w:rPr>
           <w:rFonts w:ascii="Times New Roman" w:hAnsi="Times New Roman" w:cs="Times New Roman"/>
         </w:rPr>
-        <w:t>Discuss 反铁电体（AFE）的基本特征：晶体结构、P-E回线、相变行为、典型材料体系。本论文所研究的 {paper.system} 属于哪类 AFE 体系？请结合关键词 {paper.keywords} 展开。</w:t>
+        <w:t>Describe the fundamental characteristics of antiferroelectrics (AFE): crystal structure, P-E hysteresis loop, phase transition behavior, and representative material systems. Identify which AFE category {paper.system} belongs to. Draw on key terms {paper.keywords}.</w:t>
       </w:r>
       <w:r>
         <w:rPr>
@@ -248,7 +248,7 @@
         <w:rPr>
           <w:rFonts w:ascii="Times New Roman" w:hAnsi="Times New Roman" w:cs="Times New Roman"/>
         </w:rPr>
-        <w:t>- 储能兴趣的再兴起：阐述从 AFE 向弛豫 AFE 过渡的驱动力，与本论文的 {paper.system} 体系研究背景相衔接。可参考关键术语：{paper.key_terms}。</w:t>
+        <w:t>- Resurgence of energy storage interest: explain the driving forces behind the AFE → relaxor-AFE transition, connecting to the research background of {paper.system}. Reference key terminology: {paper.key_terms}.</w:t>
       </w:r>
     </w:p>
     <w:p>
@@ -350,7 +350,7 @@
         <w:rPr>
           <w:rFonts w:ascii="Times New Roman" w:hAnsi="Times New Roman" w:cs="Times New Roman"/>
         </w:rPr>
-        <w:t>- 典型 Relaxor AFE 体系与特征：结合本论文 {paper.system}，介绍 KNN 基、NBT 基、AN 基等体系及其结构与性能特征。</w:t>
+        <w:t>- Typical relaxor-AFE systems and characteristics: introduce KNN-based, NBT-based, and AN-based systems and their structural and property features, connected to {paper.system} in this paper.</w:t>
       </w:r>
       <w:proofErr w:type="spellStart"/>
       <w:r>
@@ -384,7 +384,7 @@
         <w:rPr>
           <w:rFonts w:ascii="Times New Roman" w:hAnsi="Times New Roman" w:cs="Times New Roman"/>
         </w:rPr>
-        <w:t>- 包括：KNaNbO3(KNN) 基、Na1/2Bi1/2TiO3 (NBT) 基、AgNbO3 (AN) 基等体系。对照本论文 {paper.system}，指出其归属类别及结构差异。关键术语：{paper.key_terms}。</w:t>
+        <w:t>- Including: KNaNbO3 (KNN)-based, Na1/2Bi1/2TiO3 (NBT)-based, AgNbO3 (AN)-based systems. Identify the category and structural differences of {paper.system} against these benchmarks. Key terms: {paper.key_terms}.</w:t>
       </w:r>
     </w:p>
     <w:p>
@@ -401,7 +401,7 @@
         <w:rPr>
           <w:rFonts w:ascii="Times New Roman" w:hAnsi="Times New Roman" w:cs="Times New Roman"/>
         </w:rPr>
-        <w:t>(若论文含独立表格，列出各组成/结构/性能对比；本论文表格情况：{paper.tables})</w:t>
+        <w:t>(If the paper contains standalone tables, list the composition/structure/property comparisons; table situation in this paper: {paper.tables})</w:t>
       </w:r>
     </w:p>
     <w:p>
@@ -428,7 +428,7 @@
         <w:rPr>
           <w:rFonts w:ascii="Times New Roman" w:hAnsi="Times New Roman" w:cs="Times New Roman"/>
         </w:rPr>
-        <w:t>- 讨论当前认知的空白与不足，引出本论文 {paper.title} 的研究必要性。可引用论文图：{paper.figures}。</w:t>
+        <w:t>- Discuss the current gaps and limitations in understanding, motivating the necessity of {paper.title}. Reference paper figures: {paper.figures}.</w:t>
       </w:r>
       <w:r>
         <w:rPr>
@@ -504,7 +504,7 @@
         <w:rPr>
           <w:rFonts w:ascii="Times New Roman" w:hAnsi="Times New Roman" w:cs="Times New Roman"/>
         </w:rPr>
-        <w:t>(宏观晶体结构：XRD；微观结构：SEM、TEM、PFM 等) 本论文 {paper.system} 采用了哪些表征手段？可参考论文图：{paper.figures}，重点分析结构特征与相图。</w:t>
+        <w:t>(Macroscopic crystal structure: XRD; Microstructure: SEM, TEM, PFM, etc.) What characterization techniques does {paper.system} employ? Reference paper figures {paper.figures} with emphasis on structural features and phase diagrams.</w:t>
       </w:r>
       <w:r>
         <w:rPr>
@@ -573,7 +573,7 @@
         <w:rPr>
           <w:rFonts w:ascii="Times New Roman" w:hAnsi="Times New Roman" w:cs="Times New Roman"/>
         </w:rPr>
-        <w:t>To show 从长程（宏观）反平行极性有序到无序或局域/短程有序的演变过程，包括元素取代、高熵策略等方法。本论文中 {paper.system} 的结构演变数据（TEM/XRD/SAED）见图 {paper.figures}。关键概念：{paper.key_terms}。</w:t>
+        <w:t>Demonstrate the evolution from long-range (macroscopic) antiparallel polar order to disorder or local/short-range order, including elemental substitution and high-entropy strategies. Structural evolution data (TEM/XRD/SAED) for {paper.system} are shown in figures {paper.figures}. Key concepts: {paper.key_terms}.</w:t>
       </w:r>
     </w:p>
     <w:p>
@@ -629,7 +629,7 @@
         <w:rPr>
           <w:rFonts w:ascii="Times New Roman" w:hAnsi="Times New Roman" w:cs="Times New Roman"/>
         </w:rPr>
-        <w:t>(一般介电行为，VF 定律拟合，畴/偶极动力学，临界减慢现象) 本论文体系 {paper.system} 的介电频散行为：delta_g 参数、Tm 位置、频率依赖性。相关图：{paper.figures}。缩写释义：{paper.abbreviations}。</w:t>
+        <w:t>(General dielectric behavior, Vogel-Fulcher (VF) law fitting, domain/dipole dynamics, critical slowing-down phenomenon) Describe the dielectric dispersion behavior of {paper.system}: delta_g parameter, Tm position, frequency dependence. Related figures: {paper.figures}. Abbreviation glossary: {paper.abbreviations}.</w:t>
       </w:r>
       <w:r>
         <w:rPr>
@@ -685,7 +685,7 @@
         <w:rPr>
           <w:rFonts w:ascii="Times New Roman" w:hAnsi="Times New Roman" w:cs="Times New Roman"/>
         </w:rPr>
-        <w:t>Discuss whether {paper.system} 体系中弛豫反铁电体的介电行为满足'弛豫体'或'弛豫铁电体'的定义与特征。判据依据：{paper.key_terms}。</w:t>
+        <w:t>Discuss whether the dielectric behavior of {paper.system} satisfies the definition and characteristics of a 'relaxor' or 'relaxor ferroelectric'. Base the judgment on: {paper.key_terms}.</w:t>
       </w:r>
       <w:proofErr w:type="spellStart"/>
       <w:r>
@@ -771,7 +771,7 @@
         <w:rPr>
           <w:rFonts w:ascii="Times New Roman" w:hAnsi="Times New Roman" w:cs="Times New Roman"/>
         </w:rPr>
-        <w:t>细薄 P-E 回线 -&gt; 是否指示无序/短程有序？本论文 {paper.system} 的 P-E 回线形态（图：{paper.figures}）及其与组成 x 的关系（P_max、P_r、W_rec、eta 等）。</w:t>
+        <w:t>Slim P-E hysteresis loops — do they indicate disorder/short-range order? Describe the P-E loop morphology of {paper.system} (figures: {paper.figures}) and its relationship with composition x (P_max, P_r, W_rec, eta, etc.).</w:t>
       </w:r>
       <w:r>
         <w:rPr>
@@ -811,7 +811,7 @@
         <w:rPr>
           <w:rFonts w:ascii="Times New Roman" w:hAnsi="Times New Roman" w:cs="Times New Roman"/>
         </w:rPr>
-        <w:t>Discuss if 细薄 P-E 回线是否是被称为'弛豫体'或'弛豫铁电体'的充分条件，结合 {paper.system} 体系及缩写 {paper.abbreviations} 给出判断。</w:t>
+        <w:t>Discuss whether a slim P-E hysteresis loop is a sufficient condition to be called a 'relaxor' or 'relaxor ferroelectric'. Evaluate using {paper.system} and abbreviations {paper.abbreviations}.</w:t>
       </w:r>
       <w:proofErr w:type="spellEnd"/>
       <w:r>
@@ -885,7 +885,7 @@
         <w:rPr>
           <w:rFonts w:ascii="Times New Roman" w:hAnsi="Times New Roman" w:cs="Times New Roman"/>
         </w:rPr>
-        <w:t>- 补充：{paper.key_terms} 中涉及的其他极化相关物理量（如 Pmax、delta_g 等），结合实验数据（图：{paper.figures}）分析。</w:t>
+        <w:t>- Additional: discuss other polarization-related physical quantities in {paper.key_terms} (e.g., Pmax, delta_g, etc.), analyzed against experimental data (figures: {paper.figures}).</w:t>
       </w:r>
     </w:p>
     <w:p>
@@ -934,11 +934,11 @@
         <w:rPr>
           <w:rFonts w:ascii="Times New Roman" w:hAnsi="Times New Roman" w:cs="Times New Roman"/>
         </w:rPr>
-        <w:t>5.1 储能应用</w:t>
+        <w:t>5.1 Energy Storage Applications</w:t>
         <w:br/>
-        <w:t xml:space="preserve">  5.1.1 储能基础（细薄回线、W_rec 与效率 eta、无序机制、改善原理）。本论文 {paper.system} 的储能机制：{paper.key_terms}。</w:t>
+        <w:t xml:space="preserve">  5.1.1 Energy storage fundamentals (slim loops, W_rec and efficiency eta, disorder mechanisms, improvement principles). Energy storage mechanism of {paper.system}: {paper.key_terms}.</w:t>
         <w:br/>
-        <w:t xml:space="preserve">  5.1.2 弛豫反铁电体用于储能——本论文实验数据（图：{paper.figures}）。</w:t>
+        <w:t xml:space="preserve">  5.1.2 Relaxor-AFE for energy storage — experimental data in this paper (figures: {paper.figures}).</w:t>
       </w:r>
       <w:r>
         <w:rPr>
@@ -1093,7 +1093,7 @@
         <w:rPr>
           <w:rFonts w:ascii="Times New Roman" w:hAnsi="Times New Roman" w:cs="Times New Roman"/>
         </w:rPr>
-        <w:t>5.1.3 设计高储能密度新材料的策略：从 {paper.system} 的成功经验归纳方法论（如 CAFE 区调控、La 掺杂等）。关键指标 W_rec、eta、E_b 见量化对比（关键术语：{paper.key_terms}）。</w:t>
+        <w:t>5.1.3 Strategy for designing high energy-density materials: synthesize a methodology from the success of {paper.system} (e.g., CAFE region tuning, La doping). Key metrics W_rec, eta, E_b for quantitative comparison (key terms: {paper.key_terms}).</w:t>
       </w:r>
     </w:p>
     <w:p>
@@ -1112,7 +1112,7 @@
         <w:rPr>
           <w:rFonts w:ascii="Times New Roman" w:hAnsi="Times New Roman" w:cs="Times New Roman"/>
         </w:rPr>
-        <w:t>- 弛豫反铁电体的其他应用（超声、传感、制冷等）。如本论文 {paper.title} 涉及此类应用（图：{paper.figures}），请描述；否则写'本论文未直接涉及其他应用'。</w:t>
+        <w:t>- Other relaxor-AFE applications (ultrasound, sensing, electrocaloric cooling, etc.). If {paper.title} addresses such applications (figures: {paper.figures}), describe them; otherwise write 'This paper does not directly address other applications'.</w:t>
       </w:r>
       <w:r>
         <w:rPr>
@@ -1195,7 +1195,7 @@
         <w:rPr>
           <w:rFonts w:ascii="Times New Roman" w:hAnsi="Times New Roman" w:cs="Times New Roman"/>
         </w:rPr>
-        <w:t>- '弛豫反铁电体'是否物理上有意义？结合本论文 {paper.system} 的实验证据（图：{paper.figures}；关键概念：{paper.key_terms}）讨论其定义的合理性。</w:t>
+        <w:t>- Is 'relaxor antiferroelectric' physically meaningful? Discuss the reasonableness of the definition using experimental evidence from {paper.system} (figures: {paper.figures}; key concepts: {paper.key_terms}).</w:t>
       </w:r>
       <w:r>
         <w:rPr>
@@ -1237,7 +1237,7 @@
         <w:rPr>
           <w:rFonts w:ascii="Times New Roman" w:hAnsi="Times New Roman" w:cs="Times New Roman"/>
         </w:rPr>
-        <w:t>- 如何在'弛豫体'分类框架中定位 {paper.system}？讨论 NAFE/CAFE/RAFE 分类体系（缩写：{paper.abbreviations}）及判据。</w:t>
+        <w:t>- How to position {paper.system} within the 'relaxor' classification framework? Discuss the NAFE/CAFE/RAFE classification scheme (abbreviations: {paper.abbreviations}) and its criteria.</w:t>
       </w:r>
       <w:proofErr w:type="spellStart"/>
       <w:r>
@@ -1269,7 +1269,7 @@
         <w:rPr>
           <w:rFonts w:ascii="Times New Roman" w:hAnsi="Times New Roman" w:cs="Times New Roman"/>
         </w:rPr>
-        <w:t>- 补充讨论：{paper.key_terms} 中其余重要概念，如机制创新、方法局限、开放性问题等。</w:t>
+        <w:t>- Additional discussion: remaining important concepts in {paper.key_terms}, such as mechanistic innovations, methodological limitations, and open questions.</w:t>
       </w:r>
     </w:p>
     <w:p>
@@ -1383,37 +1383,37 @@
         <w:pStyle w:val="a9"/>
       </w:pPr>
       <w:r>
-        <w:t>12 合成与制备方法 · Synthesis and Preparation</w:t>
+        <w:t>12 Synthesis and Preparation</w:t>
       </w:r>
     </w:p>
     <w:p>
       <w:pPr/>
       <w:r>
-        <w:t>OPTIONAL — 仅当论文有对应内容时填写；否则写：本论文未涉及合成方法 / Not directly addressed in this paper.</w:t>
-      </w:r>
-    </w:p>
-    <w:p>
-      <w:pPr>
-        <w:pStyle w:val="a9"/>
-      </w:pPr>
-      <w:r>
-        <w:t>· 描述本论文 {paper.system} 所采用的合成路径（固相反应 / 溶胶凝胶 / 放电等离子烧结 / 化学溶液沉积 / 闪速退火等）。若论文给出具体工艺参数（烧结温度、保温时间、退火速率、气氛、掺杂量），请列出。可参考论文图：{paper.figures}。</w:t>
-      </w:r>
-    </w:p>
-    <w:p>
-      <w:pPr>
-        <w:pStyle w:val="a9"/>
-      </w:pPr>
-      <w:r>
-        <w:t>· 关键工艺变量：原料化学纯度、烧结密度、晶粒尺寸（图：{paper.figures}），及它们如何影响最终性能（{paper.key_terms}）。</w:t>
-      </w:r>
-    </w:p>
-    <w:p>
-      <w:pPr>
-        <w:pStyle w:val="a9"/>
-      </w:pPr>
-      <w:r>
-        <w:t>· 指出本论文中是否存在新颖或非常规的制备技术。如无，写'采用常规固相反应法，无特殊工艺创新'。如论文为综述/理论性质，写'本论文为综述/理论性质，未直接涉及合成方法'。</w:t>
+        <w:t>OPTIONAL — Fill in only if the paper contains relevant content; otherwise write: This paper does not directly address synthesis methods.</w:t>
+      </w:r>
+    </w:p>
+    <w:p>
+      <w:pPr>
+        <w:pStyle w:val="a9"/>
+      </w:pPr>
+      <w:r>
+        <w:t>· Describe the synthesis route adopted for {paper.system} (solid-state reaction / sol-gel / spark plasma sintering / chemical solution deposition / flash annealing, etc.). If the paper provides specific process parameters (sintering temperature, dwelling time, annealing rate, atmosphere, dopant amounts), list them. Reference paper figures: {paper.figures}.</w:t>
+      </w:r>
+    </w:p>
+    <w:p>
+      <w:pPr>
+        <w:pStyle w:val="a9"/>
+      </w:pPr>
+      <w:r>
+        <w:t>· Key process variables: raw-material chemical purity, sintering density, grain size (figures: {paper.figures}), and how they affect final performance ({paper.key_terms}).</w:t>
+      </w:r>
+    </w:p>
+    <w:p>
+      <w:pPr>
+        <w:pStyle w:val="a9"/>
+      </w:pPr>
+      <w:r>
+        <w:t>· Identify any novel or unconventional fabrication techniques in this paper. If none, write 'Conventional solid-state reaction method with no special process innovations'. If the paper is a review or purely theoretical, write 'This paper is a review/theoretical study and does not directly address synthesis'.</w:t>
       </w:r>
     </w:p>
     <w:p>
@@ -1427,37 +1427,37 @@
         <w:pStyle w:val="a9"/>
       </w:pPr>
       <w:r>
-        <w:t>13 表征技术 · Characterization Techniques</w:t>
+        <w:t>13 Characterization Techniques</w:t>
       </w:r>
     </w:p>
     <w:p>
       <w:pPr/>
       <w:r>
-        <w:t>OPTIONAL — 仅当论文有对应内容时填写；否则写：本论文未涉及 / Not directly addressed in this paper.</w:t>
-      </w:r>
-    </w:p>
-    <w:p>
-      <w:pPr>
-        <w:pStyle w:val="a9"/>
-      </w:pPr>
-      <w:r>
-        <w:t>· 列出论文中所有实验表征技术（XRD、TEM、SEM、FTIR、Raman、阻抗谱、P-E 回线测量等）。对于 {paper.system}，明确每种技术揭示了哪类信息（图：{paper.figures}）。缩写：{paper.abbreviations}。</w:t>
-      </w:r>
-    </w:p>
-    <w:p>
-      <w:pPr>
-        <w:pStyle w:val="a9"/>
-      </w:pPr>
-      <w:r>
-        <w:t>· 说明各表征技术的分辨率/灵敏度，及其对理解 {paper.system} 结构或性能的贡献。关键概念：{paper.key_terms}。</w:t>
-      </w:r>
-    </w:p>
-    <w:p>
-      <w:pPr>
-        <w:pStyle w:val="a9"/>
-      </w:pPr>
-      <w:r>
-        <w:t>· 指出表征空白（如缺少原位测量、温度范围有限、缺少中子衍射等），评估其对结论可靠性的影响。图注批判分析：{paper.fig_observations_brief}。</w:t>
+        <w:t>OPTIONAL — Fill in only if the paper contains relevant content; otherwise write: This paper does not directly address this topic.</w:t>
+      </w:r>
+    </w:p>
+    <w:p>
+      <w:pPr>
+        <w:pStyle w:val="a9"/>
+      </w:pPr>
+      <w:r>
+        <w:t>· List all experimental characterization techniques in the paper (XRD, TEM, SEM, FTIR, Raman, impedance spectroscopy, P-E loop measurement, etc.). For {paper.system}, specify what information each technique reveals (figures: {paper.figures}). Abbreviations: {paper.abbreviations}.</w:t>
+      </w:r>
+    </w:p>
+    <w:p>
+      <w:pPr>
+        <w:pStyle w:val="a9"/>
+      </w:pPr>
+      <w:r>
+        <w:t>· State the resolution/sensitivity of each characterization technique and its contribution to understanding the structure or properties of {paper.system}. Key concepts: {paper.key_terms}.</w:t>
+      </w:r>
+    </w:p>
+    <w:p>
+      <w:pPr>
+        <w:pStyle w:val="a9"/>
+      </w:pPr>
+      <w:r>
+        <w:t>· Identify characterization gaps (e.g., lack of in-situ measurements, limited temperature range, absence of neutron diffraction), and assess their impact on the reliability of conclusions. Critical figure analysis: {paper.fig_observations_brief}.</w:t>
       </w:r>
     </w:p>
     <w:p>
@@ -1471,37 +1471,37 @@
         <w:pStyle w:val="a9"/>
       </w:pPr>
       <w:r>
-        <w:t>14 理论框架与数学模型 · Theoretical Framework and Mathematical Model</w:t>
+        <w:t>14 Theoretical Framework and Mathematical Model</w:t>
       </w:r>
     </w:p>
     <w:p>
       <w:pPr/>
       <w:r>
-        <w:t>OPTIONAL — 仅当论文有对应内容时填写；否则写：本论文未涉及理论框架 / Not directly addressed in this paper.</w:t>
-      </w:r>
-    </w:p>
-    <w:p>
-      <w:pPr>
-        <w:pStyle w:val="a9"/>
-      </w:pPr>
-      <w:r>
-        <w:t>· 列出本论文 {paper.system} 涉及的物理理论或数学模型（如 Landau 自由能、Curie-Weiss 定律 epsilon(T)=C/(T-T_C)、Vogel-Fulcher 关系 f=f0*exp(-E_a/(k_B*(T-T_f)))、改良 Curie-Weiss 定律 1/epsilon-1/epsilon_m=(T-T_m)^gamma/C、Landau 能量轮廓、密度泛函理论、相场模拟等）。给出关键公式的 Unicode 表达式并定义参数。关键术语：{paper.key_terms}；缩写：{paper.abbreviations}。</w:t>
-      </w:r>
-    </w:p>
-    <w:p>
-      <w:pPr>
-        <w:pStyle w:val="a9"/>
-      </w:pPr>
-      <w:r>
-        <w:t>· 说明模型参数如何与实验数据拟合（图：{paper.figures}），以及它们提供了哪些物理洞见（如 delta_g 量化弛豫度、Ea 表征电导激活能等）。图注分析：{paper.fig_observations_brief}。</w:t>
-      </w:r>
-    </w:p>
-    <w:p>
-      <w:pPr>
-        <w:pStyle w:val="a9"/>
-      </w:pPr>
-      <w:r>
-        <w:t>· 指出模型假设或近似的局限性（如线性假设、忽略畴壁钉扎、未考虑热激活等），评估其对 {paper.system} 结论的影响。</w:t>
+        <w:t>OPTIONAL — Fill in only if the paper contains relevant content; otherwise write: This paper does not directly address theoretical frameworks.</w:t>
+      </w:r>
+    </w:p>
+    <w:p>
+      <w:pPr>
+        <w:pStyle w:val="a9"/>
+      </w:pPr>
+      <w:r>
+        <w:t>· List the physical theories or mathematical models used for {paper.system} (e.g., Landau free energy, Curie-Weiss law epsilon(T)=C/(T-T_C), Vogel-Fulcher relation f=f0*exp(-E_a/(k_B*(T-T_f))), modified Curie-Weiss law 1/epsilon - 1/epsilon_m = (T-Tm)^gamma / C). Reference {paper.figures} for fitting curves.</w:t>
+      </w:r>
+    </w:p>
+    <w:p>
+      <w:pPr>
+        <w:pStyle w:val="a9"/>
+      </w:pPr>
+      <w:r>
+        <w:t>· Explain how model parameters are fitted to experimental data (figures: {paper.figures}), and what physical insights they provide (e.g., delta_g quantifies relaxation degree, Ea characterizes conductance activation energy). Figure analysis: {paper.fig_observations_brief}.</w:t>
+      </w:r>
+    </w:p>
+    <w:p>
+      <w:pPr>
+        <w:pStyle w:val="a9"/>
+      </w:pPr>
+      <w:r>
+        <w:t>· Identify the limitations of model assumptions or approximations (e.g., linear assumption, ignoring domain-wall pinning, neglecting thermal activation), and assess their impact on conclusions for {paper.system}.</w:t>
       </w:r>
     </w:p>
     <w:p>
@@ -1515,37 +1515,37 @@
         <w:pStyle w:val="a9"/>
       </w:pPr>
       <w:r>
-        <w:t>15 关键性能指标量化对比 · Quantitative Performance Metrics</w:t>
+        <w:t>15 Quantitative Performance Metrics</w:t>
       </w:r>
     </w:p>
     <w:p>
       <w:pPr/>
       <w:r>
-        <w:t>OPTIONAL — 仅当论文有对应内容时填写；否则写：本论文未涉及量化性能数据 / Not directly addressed in this paper.</w:t>
-      </w:r>
-    </w:p>
-    <w:p>
-      <w:pPr>
-        <w:pStyle w:val="a9"/>
-      </w:pPr>
-      <w:r>
-        <w:t>· 提取并以表格形式列出本论文 {paper.system} 的关键性能指标：W_rec (J/cm3)、eta (%)、E_b (kV/cm)、P_max (uC/cm2)、温度稳定性范围、频率范围等。如论文给出多个组成（如 ANT-xLa, x=0,1,2,3,4,5），逐一列出 x-性能关系。参考图：{paper.figures}；关键术语：{paper.key_terms}。</w:t>
-      </w:r>
-    </w:p>
-    <w:p>
-      <w:pPr>
-        <w:pStyle w:val="a9"/>
-      </w:pPr>
-      <w:r>
-        <w:t>· 标注每个指标的测试条件（温度、频率、电场强度）及对应样品编号（如 x=0.03, ANT-3La），以便读者定位最优样品。图注分析：{paper.fig_observations_brief}。</w:t>
-      </w:r>
-    </w:p>
-    <w:p>
-      <w:pPr>
-        <w:pStyle w:val="a9"/>
-      </w:pPr>
-      <w:r>
-        <w:t>· 与论文引用的对照体系（NBT 基 / KNN 基 / AN 基 / PZT 等）做横向对比，说明本工作的性能优势量级。关键词：{paper.keywords}；缩写：{paper.abbreviations}。</w:t>
+        <w:t>OPTIONAL — Fill in only if the paper contains relevant quantitative data; otherwise write: This paper does not directly address quantitative performance data.</w:t>
+      </w:r>
+    </w:p>
+    <w:p>
+      <w:pPr>
+        <w:pStyle w:val="a9"/>
+      </w:pPr>
+      <w:r>
+        <w:t>· Extract and tabulate the key performance metrics of {paper.system}: W_rec (J/cm3), eta (%), E_b (kV/cm), P_max (uC/cm2), temperature stability range, frequency range, etc. If the paper reports multiple compositions (e.g., ANT-xLa, x=0,1,2,3,4,5), list the x-vs-performance relationship.</w:t>
+      </w:r>
+    </w:p>
+    <w:p>
+      <w:pPr>
+        <w:pStyle w:val="a9"/>
+      </w:pPr>
+      <w:r>
+        <w:t>· Annotate the test conditions (temperature, frequency, field strength) and sample labels (e.g., x=0.03, ANT-3La) for each metric, so readers can locate the optimal sample. Figure analysis: {paper.fig_observations_brief}.</w:t>
+      </w:r>
+    </w:p>
+    <w:p>
+      <w:pPr>
+        <w:pStyle w:val="a9"/>
+      </w:pPr>
+      <w:r>
+        <w:t>· Compare against benchmark systems cited in the paper (NBT-based / KNN-based / AN-based / PZT, etc.), quantifying the performance advantage. Keywords: {paper.keywords}; abbreviations: {paper.abbreviations}.</w:t>
       </w:r>
     </w:p>
     <w:p>
@@ -1559,37 +1559,37 @@
         <w:pStyle w:val="a9"/>
       </w:pPr>
       <w:r>
-        <w:t>16 与既往工作的对比 · Comparison with Prior Work</w:t>
+        <w:t>16 Comparison with Prior Work</w:t>
       </w:r>
     </w:p>
     <w:p>
       <w:pPr/>
       <w:r>
-        <w:t>OPTIONAL — 仅当论文有对应内容时填写；否则写：本论文未涉及 / Not directly addressed in this paper.</w:t>
-      </w:r>
-    </w:p>
-    <w:p>
-      <w:pPr>
-        <w:pStyle w:val="a9"/>
-      </w:pPr>
-      <w:r>
-        <w:t>· 将本论文 {paper.system} 的结果置于已有文献中：哪些先前体系或基准被超越，超越幅度多少（请量化）？关键词：{paper.keywords}。参考论文图（含对比图）：{paper.figures}。</w:t>
-      </w:r>
-    </w:p>
-    <w:p>
-      <w:pPr>
-        <w:pStyle w:val="a9"/>
-      </w:pPr>
-      <w:r>
-        <w:t>· 指出本论文声称的具体创新点：创纪录指标、新机制、新材料体系——用 {paper.key_terms} 中的术语描述。</w:t>
-      </w:r>
-    </w:p>
-    <w:p>
-      <w:pPr>
-        <w:pStyle w:val="a9"/>
-      </w:pPr>
-      <w:r>
-        <w:t>· 指出与其他研究组结论的直接矛盾或未解张力。图注批判性分析：{paper.fig_observations_brief}。</w:t>
+        <w:t>OPTIONAL — Fill in only if the paper contains relevant content; otherwise write: This paper does not directly address this topic.</w:t>
+      </w:r>
+    </w:p>
+    <w:p>
+      <w:pPr>
+        <w:pStyle w:val="a9"/>
+      </w:pPr>
+      <w:r>
+        <w:t>· Place the results of {paper.system} in the context of existing literature: which prior systems or benchmarks are surpassed, and by how much (quantify)? Keywords: {paper.keywords}. Reference paper figures (including comparison figures): {paper.figures}.</w:t>
+      </w:r>
+    </w:p>
+    <w:p>
+      <w:pPr>
+        <w:pStyle w:val="a9"/>
+      </w:pPr>
+      <w:r>
+        <w:t>· Identify the specific innovations claimed by this paper: record-setting metrics, new mechanisms, new material systems — described using terminology from {paper.key_terms}.</w:t>
+      </w:r>
+    </w:p>
+    <w:p>
+      <w:pPr>
+        <w:pStyle w:val="a9"/>
+      </w:pPr>
+      <w:r>
+        <w:t>· Identify direct contradictions or unresolved tensions with conclusions from other research groups. Critical figure analysis: {paper.fig_observations_brief}.</w:t>
       </w:r>
     </w:p>
     <w:p>
@@ -1603,37 +1603,37 @@
         <w:pStyle w:val="a9"/>
       </w:pPr>
       <w:r>
-        <w:t>17 局限与未解问题 · Limitations and Open Questions</w:t>
+        <w:t>17 Limitations and Open Questions</w:t>
       </w:r>
     </w:p>
     <w:p>
       <w:pPr/>
       <w:r>
-        <w:t>OPTIONAL — 仅当论文有对应内容时填写；否则写：本论文未涉及 / Not directly addressed in this paper.</w:t>
-      </w:r>
-    </w:p>
-    <w:p>
-      <w:pPr>
-        <w:pStyle w:val="a9"/>
-      </w:pPr>
-      <w:r>
-        <w:t>· 列举本论文 {paper.system} 明确声明和隐含的局限（组成范围窄、温度/频率窗口有限、缺乏疲劳/循环数据、模型假设等）。批判性图注：{paper.fig_observations_brief}。</w:t>
-      </w:r>
-    </w:p>
-    <w:p>
-      <w:pPr>
-        <w:pStyle w:val="a9"/>
-      </w:pPr>
-      <w:r>
-        <w:t>· 指出本论文留下的开放性科学问题（部分解答或未解答）。关键术语：{paper.key_terms}；缩写：{paper.abbreviations}。</w:t>
-      </w:r>
-    </w:p>
-    <w:p>
-      <w:pPr>
-        <w:pStyle w:val="a9"/>
-      </w:pPr>
-      <w:r>
-        <w:t>· 基于 {paper.key_terms} 的发展方向，提出后续研究建议（实验、模型、新组成）以解决上述不确定性。关键词：{paper.keywords}。</w:t>
+        <w:t>OPTIONAL — Fill in only if the paper contains relevant content; otherwise write: This paper does not directly address this topic.</w:t>
+      </w:r>
+    </w:p>
+    <w:p>
+      <w:pPr>
+        <w:pStyle w:val="a9"/>
+      </w:pPr>
+      <w:r>
+        <w:t>· List the explicit and implicit limitations of {paper.system} in this paper (narrow composition range, limited temperature/frequency window, lack of fatigue/cycling data, model assumptions, etc.). Critical figure analysis: {paper.fig_observations_brief}.</w:t>
+      </w:r>
+    </w:p>
+    <w:p>
+      <w:pPr>
+        <w:pStyle w:val="a9"/>
+      </w:pPr>
+      <w:r>
+        <w:t>· Identify open scientific questions left by this paper (partially or fully unresolved). Key terms: {paper.key_terms}; abbreviations: {paper.abbreviations}.</w:t>
+      </w:r>
+    </w:p>
+    <w:p>
+      <w:pPr>
+        <w:pStyle w:val="a9"/>
+      </w:pPr>
+      <w:r>
+        <w:t>· Based on the development direction of {paper.key_terms}, propose follow-up research recommendations (experiments, models, new compositions) to address the above uncertainties. Keywords: {paper.keywords}.</w:t>
       </w:r>
     </w:p>
     <w:p>

</xml_diff>